<commit_message>
Release 1.34.0 — Progress bar for large L1 folder updates, unified Notice template picker, filename fixes
Add a filling progress bar to Works List "Update from L1" so a large
Tender Evaluations folder (500+ PDFs) no longer looks frozen while it's
matched. Consolidate the Notice for Non-conclusion of Agreement's
Format 1/2 choice into the shared Settings → Document Templates picker
(was a per-tile dropdown), with exports named after the NIT No. Give
Intimation exports now also include the Tender ID. Fix the Works List
row-highlight picking the wrong row after a multi-file L1 update, and
make the login screen honor the chosen theme immediately.

Co-Authored-By: Claude Sonnet 5 <noreply@anthropic.com>
</commit_message>
<xml_diff>
--- a/resources/agreement-template.docx
+++ b/resources/agreement-template.docx
@@ -616,289 +616,320 @@
         <w:t>{Name of the work}}</w:t>
       </w:r>
     </w:p>
-    <w:p>
-      <w:pPr>
-        <w:spacing w:after="0" w:line="240" w:lineRule="auto"/>
-        <w:ind w:left="1440" w:right="144" w:firstLine="720"/>
-        <w:rPr>
-          <w:rFonts w:ascii="Tahoma" w:hAnsi="Tahoma" w:cs="Tahoma"/>
-          <w:b/>
-          <w:sz w:val="20"/>
-          <w:szCs w:val="20"/>
-        </w:rPr>
-      </w:pPr>
-      <w:r>
-        <w:rPr>
-          <w:rFonts w:ascii="Tahoma" w:hAnsi="Tahoma" w:cs="Tahoma"/>
-          <w:b/>
-          <w:sz w:val="20"/>
-          <w:szCs w:val="20"/>
-        </w:rPr>
-        <w:t>Amount of Estimate</w:t>
-      </w:r>
-      <w:r>
-        <w:rPr>
-          <w:rFonts w:ascii="Tahoma" w:hAnsi="Tahoma" w:cs="Tahoma"/>
-          <w:b/>
-          <w:sz w:val="20"/>
-          <w:szCs w:val="20"/>
-        </w:rPr>
-        <w:tab/>
-        <w:t xml:space="preserve">          </w:t>
-      </w:r>
-      <w:proofErr w:type="gramStart"/>
-      <w:r>
-        <w:rPr>
-          <w:rFonts w:ascii="Tahoma" w:hAnsi="Tahoma" w:cs="Tahoma"/>
-          <w:b/>
-          <w:sz w:val="20"/>
-          <w:szCs w:val="20"/>
-        </w:rPr>
-        <w:t xml:space="preserve">  :</w:t>
-      </w:r>
-      <w:r>
-        <w:rPr>
-          <w:rFonts w:ascii="Tahoma" w:hAnsi="Tahoma" w:cs="Tahoma"/>
-          <w:bCs/>
-          <w:sz w:val="20"/>
-          <w:szCs w:val="20"/>
-        </w:rPr>
-        <w:t>Rs.</w:t>
-      </w:r>
-      <w:r>
-        <w:rPr>
-          <w:rFonts w:ascii="Tahoma" w:hAnsi="Tahoma" w:cs="Tahoma"/>
-          <w:bCs/>
-          <w:sz w:val="20"/>
-          <w:szCs w:val="20"/>
-        </w:rPr>
-        <w:t>{</w:t>
-      </w:r>
-      <w:proofErr w:type="gramEnd"/>
-      <w:r>
-        <w:rPr>
-          <w:rFonts w:ascii="Tahoma" w:hAnsi="Tahoma" w:cs="Tahoma"/>
-          <w:bCs/>
-          <w:sz w:val="20"/>
-          <w:szCs w:val="20"/>
-        </w:rPr>
-        <w:t>{Estimate Amount}}</w:t>
-      </w:r>
-      <w:r>
-        <w:rPr>
-          <w:rFonts w:ascii="Tahoma" w:hAnsi="Tahoma" w:cs="Tahoma"/>
-          <w:bCs/>
-          <w:sz w:val="20"/>
-          <w:szCs w:val="20"/>
-        </w:rPr>
-        <w:t xml:space="preserve"> Lakhs</w:t>
-      </w:r>
-    </w:p>
-    <w:p>
-      <w:pPr>
-        <w:spacing w:after="0" w:line="240" w:lineRule="auto"/>
-        <w:rPr>
-          <w:rFonts w:ascii="Tahoma" w:hAnsi="Tahoma" w:cs="Tahoma"/>
-          <w:b/>
-          <w:sz w:val="20"/>
-          <w:szCs w:val="20"/>
-        </w:rPr>
-      </w:pPr>
-      <w:r>
-        <w:rPr>
-          <w:rFonts w:ascii="Tahoma" w:hAnsi="Tahoma" w:cs="Tahoma"/>
-          <w:b/>
-          <w:sz w:val="20"/>
-          <w:szCs w:val="20"/>
-        </w:rPr>
-        <w:t xml:space="preserve">                                    Estimated Contract Value</w:t>
-      </w:r>
-      <w:r>
-        <w:rPr>
-          <w:rFonts w:ascii="Tahoma" w:hAnsi="Tahoma" w:cs="Tahoma"/>
-          <w:b/>
-          <w:sz w:val="20"/>
-          <w:szCs w:val="20"/>
-        </w:rPr>
-        <w:tab/>
-        <w:t>:</w:t>
-      </w:r>
-      <w:r>
-        <w:rPr>
-          <w:rFonts w:ascii="Tahoma" w:hAnsi="Tahoma" w:cs="Tahoma"/>
-          <w:bCs/>
-          <w:sz w:val="20"/>
-          <w:szCs w:val="20"/>
-        </w:rPr>
-        <w:t xml:space="preserve"> {{ECV}}</w:t>
-      </w:r>
-    </w:p>
-    <w:p>
-      <w:pPr>
-        <w:spacing w:after="0" w:line="240" w:lineRule="auto"/>
-        <w:ind w:left="1440" w:firstLine="720"/>
-        <w:rPr>
-          <w:rFonts w:ascii="Tahoma" w:hAnsi="Tahoma" w:cs="Tahoma"/>
-          <w:b/>
-          <w:sz w:val="20"/>
-          <w:szCs w:val="20"/>
-        </w:rPr>
-      </w:pPr>
-      <w:r>
-        <w:rPr>
-          <w:rFonts w:ascii="Tahoma" w:hAnsi="Tahoma" w:cs="Tahoma"/>
-          <w:b/>
-          <w:sz w:val="20"/>
-          <w:szCs w:val="20"/>
-        </w:rPr>
-        <w:t>Tender Percentage</w:t>
-      </w:r>
-      <w:r>
-        <w:rPr>
-          <w:rFonts w:ascii="Tahoma" w:hAnsi="Tahoma" w:cs="Tahoma"/>
-          <w:b/>
-          <w:sz w:val="20"/>
-          <w:szCs w:val="20"/>
-        </w:rPr>
-        <w:tab/>
-      </w:r>
-      <w:r>
-        <w:rPr>
-          <w:rFonts w:ascii="Tahoma" w:hAnsi="Tahoma" w:cs="Tahoma"/>
-          <w:b/>
-          <w:sz w:val="20"/>
-          <w:szCs w:val="20"/>
-        </w:rPr>
-        <w:tab/>
-        <w:t xml:space="preserve">: </w:t>
-      </w:r>
-      <w:r>
-        <w:rPr>
-          <w:rFonts w:ascii="Tahoma" w:hAnsi="Tahoma" w:cs="Tahoma"/>
-          <w:b/>
-          <w:sz w:val="20"/>
-          <w:szCs w:val="20"/>
-        </w:rPr>
-        <w:t>(</w:t>
-      </w:r>
-      <w:proofErr w:type="gramStart"/>
-      <w:r>
-        <w:rPr>
-          <w:rFonts w:ascii="Tahoma" w:hAnsi="Tahoma" w:cs="Tahoma"/>
-          <w:b/>
-          <w:sz w:val="20"/>
-          <w:szCs w:val="20"/>
-        </w:rPr>
-        <w:t>-)</w:t>
-      </w:r>
-      <w:r>
-        <w:rPr>
-          <w:rFonts w:ascii="Tahoma" w:hAnsi="Tahoma" w:cs="Tahoma"/>
-          <w:b/>
-          <w:sz w:val="20"/>
-          <w:szCs w:val="20"/>
-        </w:rPr>
-        <w:t>{</w:t>
-      </w:r>
-      <w:proofErr w:type="gramEnd"/>
-      <w:r>
-        <w:rPr>
-          <w:rFonts w:ascii="Tahoma" w:hAnsi="Tahoma" w:cs="Tahoma"/>
-          <w:b/>
-          <w:sz w:val="20"/>
-          <w:szCs w:val="20"/>
-        </w:rPr>
-        <w:t>{Tender percentage</w:t>
-      </w:r>
-      <w:proofErr w:type="gramStart"/>
-      <w:r>
-        <w:rPr>
-          <w:rFonts w:ascii="Tahoma" w:hAnsi="Tahoma" w:cs="Tahoma"/>
-          <w:b/>
-          <w:sz w:val="20"/>
-          <w:szCs w:val="20"/>
-        </w:rPr>
-        <w:t>}}</w:t>
-      </w:r>
-      <w:r>
-        <w:rPr>
-          <w:rFonts w:ascii="Tahoma" w:hAnsi="Tahoma" w:cs="Tahoma"/>
-          <w:b/>
-          <w:sz w:val="20"/>
-          <w:szCs w:val="20"/>
-        </w:rPr>
-        <w:t>%</w:t>
-      </w:r>
-      <w:proofErr w:type="gramEnd"/>
-      <w:r>
-        <w:rPr>
-          <w:rFonts w:ascii="Tahoma" w:hAnsi="Tahoma" w:cs="Tahoma"/>
-          <w:b/>
-          <w:sz w:val="20"/>
-          <w:szCs w:val="20"/>
-        </w:rPr>
-        <w:t>-Less</w:t>
-      </w:r>
-      <w:r>
-        <w:rPr>
-          <w:rFonts w:ascii="Tahoma" w:hAnsi="Tahoma" w:cs="Tahoma"/>
-          <w:b/>
-          <w:sz w:val="20"/>
-          <w:szCs w:val="20"/>
-        </w:rPr>
-        <w:t xml:space="preserve"> </w:t>
-      </w:r>
-    </w:p>
-    <w:p>
-      <w:pPr>
-        <w:spacing w:after="0" w:line="240" w:lineRule="auto"/>
-        <w:rPr>
-          <w:rFonts w:ascii="Tahoma" w:hAnsi="Tahoma" w:cs="Tahoma"/>
-          <w:b/>
-          <w:sz w:val="20"/>
-          <w:szCs w:val="20"/>
-        </w:rPr>
-      </w:pPr>
-      <w:r>
-        <w:rPr>
-          <w:rFonts w:ascii="Tahoma" w:hAnsi="Tahoma" w:cs="Tahoma"/>
-          <w:b/>
-          <w:sz w:val="20"/>
-          <w:szCs w:val="20"/>
-        </w:rPr>
-        <w:t xml:space="preserve">                                   </w:t>
-      </w:r>
-      <w:r>
-        <w:rPr>
-          <w:rFonts w:ascii="Tahoma" w:hAnsi="Tahoma" w:cs="Tahoma"/>
-          <w:b/>
-          <w:sz w:val="20"/>
-          <w:szCs w:val="20"/>
-        </w:rPr>
-        <w:tab/>
-        <w:t xml:space="preserve">Amount of Contract Value    </w:t>
-      </w:r>
-      <w:proofErr w:type="gramStart"/>
-      <w:r>
-        <w:rPr>
-          <w:rFonts w:ascii="Tahoma" w:hAnsi="Tahoma" w:cs="Tahoma"/>
-          <w:b/>
-          <w:sz w:val="20"/>
-          <w:szCs w:val="20"/>
-        </w:rPr>
-        <w:t xml:space="preserve">  :</w:t>
-      </w:r>
-      <w:proofErr w:type="gramEnd"/>
-      <w:r>
-        <w:rPr>
-          <w:rFonts w:ascii="Tahoma" w:hAnsi="Tahoma" w:cs="Tahoma"/>
-          <w:bCs/>
-          <w:sz w:val="20"/>
-          <w:szCs w:val="20"/>
-        </w:rPr>
-        <w:t>{{Contract value}}</w:t>
-      </w:r>
-    </w:p>
+    <w:tbl>
+      <w:tblPr>
+        <w:tblW w:w="6900" w:type="dxa"/>
+        <w:jc w:val="center"/>
+        <w:tblLook w:val="04A0" w:firstRow="1" w:lastRow="0" w:firstColumn="1" w:lastColumn="0" w:noHBand="0" w:noVBand="1"/>
+      </w:tblPr>
+      <w:tblGrid>
+        <w:gridCol w:w="3300"/>
+        <w:gridCol w:w="3600"/>
+      </w:tblGrid>
+      <w:tr>
+        <w:trPr>
+          <w:trHeight w:val="320"/>
+        </w:trPr>
+        <w:tc>
+          <w:tcPr>
+            <w:tcW w:w="3300" w:type="dxa"/>
+            <w:tcBorders>
+              <w:top w:val="nil"/>
+              <w:left w:val="nil"/>
+              <w:bottom w:val="nil"/>
+              <w:right w:val="nil"/>
+            </w:tcBorders>
+            <w:vAlign w:val="center"/>
+          </w:tcPr>
+          <w:p>
+            <w:pPr>
+              <w:spacing w:after="0" w:line="240" w:lineRule="auto"/>
+              <w:rPr>
+                <w:rFonts w:ascii="Tahoma" w:hAnsi="Tahoma" w:cs="Tahoma"/>
+                <w:b/>
+                <w:sz w:val="20"/>
+                <w:szCs w:val="20"/>
+              </w:rPr>
+            </w:pPr>
+            <w:r>
+              <w:rPr>
+                <w:rFonts w:ascii="Tahoma" w:hAnsi="Tahoma" w:cs="Tahoma"/>
+                <w:b/>
+                <w:sz w:val="20"/>
+                <w:szCs w:val="20"/>
+              </w:rPr>
+              <w:t xml:space="preserve">Amount of Estimate</w:t>
+            </w:r>
+          </w:p>
+        </w:tc>
+        <w:tc>
+          <w:tcPr>
+            <w:tcW w:w="3600" w:type="dxa"/>
+            <w:tcBorders>
+              <w:top w:val="nil"/>
+              <w:left w:val="nil"/>
+              <w:bottom w:val="nil"/>
+              <w:right w:val="nil"/>
+            </w:tcBorders>
+            <w:vAlign w:val="center"/>
+          </w:tcPr>
+          <w:p>
+            <w:pPr>
+              <w:spacing w:after="0" w:line="240" w:lineRule="auto"/>
+              <w:rPr>
+                <w:rFonts w:ascii="Tahoma" w:hAnsi="Tahoma" w:cs="Tahoma"/>
+                <w:b/>
+                <w:sz w:val="20"/>
+                <w:szCs w:val="20"/>
+              </w:rPr>
+            </w:pPr>
+            <w:r>
+              <w:rPr>
+                <w:rFonts w:ascii="Tahoma" w:hAnsi="Tahoma" w:cs="Tahoma"/>
+                <w:b/>
+                <w:sz w:val="20"/>
+                <w:szCs w:val="20"/>
+              </w:rPr>
+              <w:t xml:space="preserve">: </w:t>
+            </w:r>
+            <w:r>
+              <w:rPr>
+                <w:rFonts w:ascii="Tahoma" w:hAnsi="Tahoma" w:cs="Tahoma"/>
+                <w:bCs/>
+                <w:sz w:val="20"/>
+                <w:szCs w:val="20"/>
+              </w:rPr>
+              <w:t xml:space="preserve">Rs.{{Estimate Amount}} Lakhs</w:t>
+            </w:r>
+          </w:p>
+        </w:tc>
+      </w:tr>
+      <w:tr>
+        <w:trPr>
+          <w:trHeight w:val="320"/>
+        </w:trPr>
+        <w:tc>
+          <w:tcPr>
+            <w:tcW w:w="3300" w:type="dxa"/>
+            <w:tcBorders>
+              <w:top w:val="nil"/>
+              <w:left w:val="nil"/>
+              <w:bottom w:val="nil"/>
+              <w:right w:val="nil"/>
+            </w:tcBorders>
+            <w:vAlign w:val="center"/>
+          </w:tcPr>
+          <w:p>
+            <w:pPr>
+              <w:spacing w:after="0" w:line="240" w:lineRule="auto"/>
+              <w:rPr>
+                <w:rFonts w:ascii="Tahoma" w:hAnsi="Tahoma" w:cs="Tahoma"/>
+                <w:b/>
+                <w:sz w:val="20"/>
+                <w:szCs w:val="20"/>
+              </w:rPr>
+            </w:pPr>
+            <w:r>
+              <w:rPr>
+                <w:rFonts w:ascii="Tahoma" w:hAnsi="Tahoma" w:cs="Tahoma"/>
+                <w:b/>
+                <w:sz w:val="20"/>
+                <w:szCs w:val="20"/>
+              </w:rPr>
+              <w:t xml:space="preserve">Estimated Contract Value</w:t>
+            </w:r>
+          </w:p>
+        </w:tc>
+        <w:tc>
+          <w:tcPr>
+            <w:tcW w:w="3600" w:type="dxa"/>
+            <w:tcBorders>
+              <w:top w:val="nil"/>
+              <w:left w:val="nil"/>
+              <w:bottom w:val="nil"/>
+              <w:right w:val="nil"/>
+            </w:tcBorders>
+            <w:vAlign w:val="center"/>
+          </w:tcPr>
+          <w:p>
+            <w:pPr>
+              <w:spacing w:after="0" w:line="240" w:lineRule="auto"/>
+              <w:rPr>
+                <w:rFonts w:ascii="Tahoma" w:hAnsi="Tahoma" w:cs="Tahoma"/>
+                <w:b/>
+                <w:sz w:val="20"/>
+                <w:szCs w:val="20"/>
+              </w:rPr>
+            </w:pPr>
+            <w:r>
+              <w:rPr>
+                <w:rFonts w:ascii="Tahoma" w:hAnsi="Tahoma" w:cs="Tahoma"/>
+                <w:b/>
+                <w:sz w:val="20"/>
+                <w:szCs w:val="20"/>
+              </w:rPr>
+              <w:t xml:space="preserve">: </w:t>
+            </w:r>
+            <w:r>
+              <w:rPr>
+                <w:rFonts w:ascii="Tahoma" w:hAnsi="Tahoma" w:cs="Tahoma"/>
+                <w:bCs/>
+                <w:sz w:val="20"/>
+                <w:szCs w:val="20"/>
+              </w:rPr>
+              <w:t xml:space="preserve">{{ECV}}</w:t>
+            </w:r>
+          </w:p>
+        </w:tc>
+      </w:tr>
+      <w:tr>
+        <w:trPr>
+          <w:trHeight w:val="320"/>
+        </w:trPr>
+        <w:tc>
+          <w:tcPr>
+            <w:tcW w:w="3300" w:type="dxa"/>
+            <w:tcBorders>
+              <w:top w:val="nil"/>
+              <w:left w:val="nil"/>
+              <w:bottom w:val="nil"/>
+              <w:right w:val="nil"/>
+            </w:tcBorders>
+            <w:vAlign w:val="center"/>
+          </w:tcPr>
+          <w:p>
+            <w:pPr>
+              <w:spacing w:after="0" w:line="240" w:lineRule="auto"/>
+              <w:rPr>
+                <w:rFonts w:ascii="Tahoma" w:hAnsi="Tahoma" w:cs="Tahoma"/>
+                <w:b/>
+                <w:sz w:val="20"/>
+                <w:szCs w:val="20"/>
+              </w:rPr>
+            </w:pPr>
+            <w:r>
+              <w:rPr>
+                <w:rFonts w:ascii="Tahoma" w:hAnsi="Tahoma" w:cs="Tahoma"/>
+                <w:b/>
+                <w:sz w:val="20"/>
+                <w:szCs w:val="20"/>
+              </w:rPr>
+              <w:t xml:space="preserve">Tender Percentage</w:t>
+            </w:r>
+          </w:p>
+        </w:tc>
+        <w:tc>
+          <w:tcPr>
+            <w:tcW w:w="3600" w:type="dxa"/>
+            <w:tcBorders>
+              <w:top w:val="nil"/>
+              <w:left w:val="nil"/>
+              <w:bottom w:val="nil"/>
+              <w:right w:val="nil"/>
+            </w:tcBorders>
+            <w:vAlign w:val="center"/>
+          </w:tcPr>
+          <w:p>
+            <w:pPr>
+              <w:spacing w:after="0" w:line="240" w:lineRule="auto"/>
+              <w:rPr>
+                <w:rFonts w:ascii="Tahoma" w:hAnsi="Tahoma" w:cs="Tahoma"/>
+                <w:b/>
+                <w:sz w:val="20"/>
+                <w:szCs w:val="20"/>
+              </w:rPr>
+            </w:pPr>
+            <w:r>
+              <w:rPr>
+                <w:rFonts w:ascii="Tahoma" w:hAnsi="Tahoma" w:cs="Tahoma"/>
+                <w:b/>
+                <w:sz w:val="20"/>
+                <w:szCs w:val="20"/>
+              </w:rPr>
+              <w:t xml:space="preserve">: (-){{Tender percentage}}%-Less</w:t>
+            </w:r>
+          </w:p>
+        </w:tc>
+      </w:tr>
+      <w:tr>
+        <w:trPr>
+          <w:trHeight w:val="320"/>
+        </w:trPr>
+        <w:tc>
+          <w:tcPr>
+            <w:tcW w:w="3300" w:type="dxa"/>
+            <w:tcBorders>
+              <w:top w:val="nil"/>
+              <w:left w:val="nil"/>
+              <w:bottom w:val="nil"/>
+              <w:right w:val="nil"/>
+            </w:tcBorders>
+            <w:vAlign w:val="center"/>
+          </w:tcPr>
+          <w:p>
+            <w:pPr>
+              <w:spacing w:after="0" w:line="240" w:lineRule="auto"/>
+              <w:rPr>
+                <w:rFonts w:ascii="Tahoma" w:hAnsi="Tahoma" w:cs="Tahoma"/>
+                <w:b/>
+                <w:sz w:val="20"/>
+                <w:szCs w:val="20"/>
+              </w:rPr>
+            </w:pPr>
+            <w:r>
+              <w:rPr>
+                <w:rFonts w:ascii="Tahoma" w:hAnsi="Tahoma" w:cs="Tahoma"/>
+                <w:b/>
+                <w:sz w:val="20"/>
+                <w:szCs w:val="20"/>
+              </w:rPr>
+              <w:t xml:space="preserve">Amount of Contract Value</w:t>
+            </w:r>
+          </w:p>
+        </w:tc>
+        <w:tc>
+          <w:tcPr>
+            <w:tcW w:w="3600" w:type="dxa"/>
+            <w:tcBorders>
+              <w:top w:val="nil"/>
+              <w:left w:val="nil"/>
+              <w:bottom w:val="nil"/>
+              <w:right w:val="nil"/>
+            </w:tcBorders>
+            <w:vAlign w:val="center"/>
+          </w:tcPr>
+          <w:p>
+            <w:pPr>
+              <w:spacing w:after="0" w:line="240" w:lineRule="auto"/>
+              <w:rPr>
+                <w:rFonts w:ascii="Tahoma" w:hAnsi="Tahoma" w:cs="Tahoma"/>
+                <w:b/>
+                <w:sz w:val="20"/>
+                <w:szCs w:val="20"/>
+              </w:rPr>
+            </w:pPr>
+            <w:r>
+              <w:rPr>
+                <w:rFonts w:ascii="Tahoma" w:hAnsi="Tahoma" w:cs="Tahoma"/>
+                <w:b/>
+                <w:sz w:val="20"/>
+                <w:szCs w:val="20"/>
+              </w:rPr>
+              <w:t xml:space="preserve">: </w:t>
+            </w:r>
+            <w:r>
+              <w:rPr>
+                <w:rFonts w:ascii="Tahoma" w:hAnsi="Tahoma" w:cs="Tahoma"/>
+                <w:bCs/>
+                <w:sz w:val="20"/>
+                <w:szCs w:val="20"/>
+              </w:rPr>
+              <w:t xml:space="preserve">{{Contract value}}</w:t>
+            </w:r>
+          </w:p>
+        </w:tc>
+      </w:tr>
+    </w:tbl>
     <w:p>
       <w:pPr>
         <w:spacing w:after="0" w:line="240" w:lineRule="auto"/>
@@ -1354,16 +1385,6 @@
         </w:rPr>
         <w:t>{{Agreement date in words}}</w:t>
       </w:r>
-    </w:p>
-    <w:p>
-      <w:pPr>
-        <w:spacing w:after="0" w:line="240" w:lineRule="auto"/>
-        <w:rPr>
-          <w:rFonts w:ascii="Tahoma" w:hAnsi="Tahoma" w:cs="Tahoma"/>
-          <w:sz w:val="20"/>
-          <w:szCs w:val="20"/>
-        </w:rPr>
-      </w:pPr>
     </w:p>
     <w:p>
       <w:pPr>

</xml_diff>

<commit_message>
Release 1.47.2 — stability fixes, refreshed agreement and intimation templates
Co-Authored-By: Claude Sonnet 5.5 <noreply@anthropic.com>
</commit_message>
<xml_diff>
--- a/resources/agreement-template.docx
+++ b/resources/agreement-template.docx
@@ -247,28 +247,7 @@
     <w:p>
       <w:pPr>
         <w:pStyle w:val="Title"/>
-        <w:rPr>
-          <w:rFonts w:ascii="Tahoma" w:hAnsi="Tahoma" w:cs="Tahoma"/>
-          <w:sz w:val="20"/>
-          <w:szCs w:val="20"/>
-          <w:u w:val="words"/>
-        </w:rPr>
-      </w:pPr>
-    </w:p>
-    <w:p>
-      <w:pPr>
-        <w:pStyle w:val="Title"/>
-        <w:rPr>
-          <w:rFonts w:ascii="Tahoma" w:hAnsi="Tahoma" w:cs="Tahoma"/>
-          <w:sz w:val="20"/>
-          <w:szCs w:val="20"/>
-          <w:u w:val="words"/>
-        </w:rPr>
-      </w:pPr>
-    </w:p>
-    <w:p>
-      <w:pPr>
-        <w:pStyle w:val="Title"/>
+        <w:spacing w:after="240"/>
         <w:jc w:val="center"/>
         <w:rPr>
           <w:rFonts w:ascii="Tahoma" w:hAnsi="Tahoma" w:cs="Tahoma"/>
@@ -286,8 +265,8 @@
           <w:bCs/>
           <w:spacing w:val="0"/>
           <w:kern w:val="0"/>
-          <w:sz w:val="20"/>
-          <w:szCs w:val="20"/>
+          <w:sz w:val="32"/>
+          <w:szCs w:val="32"/>
           <w:u w:val="single"/>
           <w:lang w:val="en-US" w:bidi="te-IN"/>
           <w14:ligatures w14:val="none"/>
@@ -301,8 +280,8 @@
           <w:bCs/>
           <w:spacing w:val="0"/>
           <w:kern w:val="0"/>
-          <w:sz w:val="20"/>
-          <w:szCs w:val="20"/>
+          <w:sz w:val="32"/>
+          <w:szCs w:val="32"/>
           <w:lang w:val="en-US" w:bidi="te-IN"/>
           <w14:ligatures w14:val="none"/>
         </w:rPr>
@@ -315,8 +294,8 @@
           <w:bCs/>
           <w:spacing w:val="0"/>
           <w:kern w:val="0"/>
-          <w:sz w:val="20"/>
-          <w:szCs w:val="20"/>
+          <w:sz w:val="32"/>
+          <w:szCs w:val="32"/>
           <w:u w:val="single"/>
           <w:lang w:val="en-US" w:bidi="te-IN"/>
           <w14:ligatures w14:val="none"/>
@@ -330,8 +309,8 @@
           <w:bCs/>
           <w:spacing w:val="0"/>
           <w:kern w:val="0"/>
-          <w:sz w:val="20"/>
-          <w:szCs w:val="20"/>
+          <w:sz w:val="32"/>
+          <w:szCs w:val="32"/>
           <w:lang w:val="en-US" w:bidi="te-IN"/>
           <w14:ligatures w14:val="none"/>
         </w:rPr>
@@ -344,8 +323,8 @@
           <w:bCs/>
           <w:spacing w:val="0"/>
           <w:kern w:val="0"/>
-          <w:sz w:val="20"/>
-          <w:szCs w:val="20"/>
+          <w:sz w:val="32"/>
+          <w:szCs w:val="32"/>
           <w:u w:val="single"/>
           <w:lang w:val="en-US" w:bidi="te-IN"/>
           <w14:ligatures w14:val="none"/>
@@ -359,8 +338,8 @@
           <w:bCs/>
           <w:spacing w:val="0"/>
           <w:kern w:val="0"/>
-          <w:sz w:val="20"/>
-          <w:szCs w:val="20"/>
+          <w:sz w:val="32"/>
+          <w:szCs w:val="32"/>
           <w:lang w:val="en-US" w:bidi="te-IN"/>
           <w14:ligatures w14:val="none"/>
         </w:rPr>
@@ -373,8 +352,8 @@
           <w:bCs/>
           <w:spacing w:val="0"/>
           <w:kern w:val="0"/>
-          <w:sz w:val="20"/>
-          <w:szCs w:val="20"/>
+          <w:sz w:val="32"/>
+          <w:szCs w:val="32"/>
           <w:u w:val="single"/>
           <w:lang w:val="en-US" w:bidi="te-IN"/>
           <w14:ligatures w14:val="none"/>
@@ -388,8 +367,8 @@
           <w:bCs/>
           <w:spacing w:val="0"/>
           <w:kern w:val="0"/>
-          <w:sz w:val="20"/>
-          <w:szCs w:val="20"/>
+          <w:sz w:val="32"/>
+          <w:szCs w:val="32"/>
           <w:lang w:val="en-US" w:bidi="te-IN"/>
           <w14:ligatures w14:val="none"/>
         </w:rPr>
@@ -403,8 +382,8 @@
           <w:bCs/>
           <w:spacing w:val="0"/>
           <w:kern w:val="0"/>
-          <w:sz w:val="20"/>
-          <w:szCs w:val="20"/>
+          <w:sz w:val="32"/>
+          <w:szCs w:val="32"/>
           <w:u w:val="single"/>
           <w:lang w:val="en-US" w:bidi="te-IN"/>
           <w14:ligatures w14:val="none"/>
@@ -419,8 +398,8 @@
           <w:bCs/>
           <w:spacing w:val="0"/>
           <w:kern w:val="0"/>
-          <w:sz w:val="20"/>
-          <w:szCs w:val="20"/>
+          <w:sz w:val="32"/>
+          <w:szCs w:val="32"/>
           <w:lang w:val="en-US" w:bidi="te-IN"/>
           <w14:ligatures w14:val="none"/>
         </w:rPr>
@@ -433,8 +412,8 @@
           <w:bCs/>
           <w:spacing w:val="0"/>
           <w:kern w:val="0"/>
-          <w:sz w:val="20"/>
-          <w:szCs w:val="20"/>
+          <w:sz w:val="32"/>
+          <w:szCs w:val="32"/>
           <w:u w:val="single"/>
           <w:lang w:val="en-US" w:bidi="te-IN"/>
           <w14:ligatures w14:val="none"/>
@@ -448,8 +427,8 @@
           <w:bCs/>
           <w:spacing w:val="0"/>
           <w:kern w:val="0"/>
-          <w:sz w:val="20"/>
-          <w:szCs w:val="20"/>
+          <w:sz w:val="32"/>
+          <w:szCs w:val="32"/>
           <w:lang w:val="en-US" w:bidi="te-IN"/>
           <w14:ligatures w14:val="none"/>
         </w:rPr>
@@ -462,8 +441,8 @@
           <w:bCs/>
           <w:spacing w:val="0"/>
           <w:kern w:val="0"/>
-          <w:sz w:val="20"/>
-          <w:szCs w:val="20"/>
+          <w:sz w:val="32"/>
+          <w:szCs w:val="32"/>
           <w:u w:val="single"/>
           <w:lang w:val="en-US" w:bidi="te-IN"/>
           <w14:ligatures w14:val="none"/>
@@ -477,8 +456,8 @@
           <w:bCs/>
           <w:spacing w:val="0"/>
           <w:kern w:val="0"/>
-          <w:sz w:val="20"/>
-          <w:szCs w:val="20"/>
+          <w:sz w:val="32"/>
+          <w:szCs w:val="32"/>
           <w:lang w:val="en-US" w:bidi="te-IN"/>
           <w14:ligatures w14:val="none"/>
         </w:rPr>
@@ -491,8 +470,8 @@
           <w:bCs/>
           <w:spacing w:val="0"/>
           <w:kern w:val="0"/>
-          <w:sz w:val="20"/>
-          <w:szCs w:val="20"/>
+          <w:sz w:val="32"/>
+          <w:szCs w:val="32"/>
           <w:u w:val="single"/>
           <w:lang w:val="en-US" w:bidi="te-IN"/>
           <w14:ligatures w14:val="none"/>
@@ -506,8 +485,8 @@
           <w:bCs/>
           <w:spacing w:val="0"/>
           <w:kern w:val="0"/>
-          <w:sz w:val="20"/>
-          <w:szCs w:val="20"/>
+          <w:sz w:val="32"/>
+          <w:szCs w:val="32"/>
           <w:lang w:val="en-US" w:bidi="te-IN"/>
           <w14:ligatures w14:val="none"/>
         </w:rPr>
@@ -520,8 +499,8 @@
           <w:bCs/>
           <w:spacing w:val="0"/>
           <w:kern w:val="0"/>
-          <w:sz w:val="20"/>
-          <w:szCs w:val="20"/>
+          <w:sz w:val="32"/>
+          <w:szCs w:val="32"/>
           <w:u w:val="single"/>
           <w:lang w:val="en-US" w:bidi="te-IN"/>
           <w14:ligatures w14:val="none"/>
@@ -532,61 +511,61 @@
     <w:p>
       <w:pPr>
         <w:tabs>
-          <w:tab w:val="left" w:pos="1500"/>
+          <w:tab w:val="left" w:pos="1900"/>
         </w:tabs>
         <w:spacing w:line="240" w:lineRule="auto"/>
-        <w:ind w:left="2600" w:hanging="2600"/>
+        <w:ind w:left="1900" w:hanging="1900"/>
         <w:jc w:val="both"/>
         <w:rPr>
           <w:rFonts w:ascii="Tahoma" w:hAnsi="Tahoma" w:cs="Tahoma"/>
-          <w:sz w:val="20"/>
-          <w:szCs w:val="20"/>
-        </w:rPr>
-      </w:pPr>
-      <w:r>
-        <w:rPr>
-          <w:rFonts w:ascii="Tahoma" w:hAnsi="Tahoma" w:cs="Tahoma"/>
-          <w:b/>
-          <w:sz w:val="20"/>
-          <w:szCs w:val="20"/>
+          <w:sz w:val="22"/>
+          <w:szCs w:val="22"/>
+        </w:rPr>
+      </w:pPr>
+      <w:r>
+        <w:rPr>
+          <w:rFonts w:ascii="Tahoma" w:hAnsi="Tahoma" w:cs="Tahoma"/>
+          <w:b/>
+          <w:sz w:val="22"/>
+          <w:szCs w:val="22"/>
         </w:rPr>
         <w:t>Name of Work:</w:t>
       </w:r>
       <w:r>
         <w:rPr>
-          <w:sz w:val="20"/>
+          <w:sz w:val="22"/>
         </w:rPr>
         <w:tab/>
       </w:r>
       <w:r>
         <w:rPr>
           <w:rFonts w:ascii="Tahoma" w:hAnsi="Tahoma" w:cs="Tahoma"/>
-          <w:sz w:val="20"/>
-          <w:szCs w:val="20"/>
+          <w:sz w:val="22"/>
+          <w:szCs w:val="22"/>
         </w:rPr>
         <w:t>{{Corporation}}-EE-</w:t>
       </w:r>
       <w:r>
         <w:rPr>
           <w:rFonts w:ascii="Tahoma" w:hAnsi="Tahoma" w:cs="Tahoma"/>
-          <w:sz w:val="20"/>
-          <w:szCs w:val="20"/>
+          <w:sz w:val="22"/>
+          <w:szCs w:val="22"/>
         </w:rPr>
         <w:t>{{Circle}}</w:t>
       </w:r>
       <w:r>
         <w:rPr>
           <w:rFonts w:ascii="Tahoma" w:hAnsi="Tahoma" w:cs="Tahoma"/>
-          <w:sz w:val="20"/>
-          <w:szCs w:val="20"/>
+          <w:sz w:val="22"/>
+          <w:szCs w:val="22"/>
         </w:rPr>
         <w:t>-CIRCLE-</w:t>
       </w:r>
       <w:r>
         <w:rPr>
           <w:rFonts w:ascii="Tahoma" w:hAnsi="Tahoma" w:cs="Tahoma"/>
-          <w:sz w:val="20"/>
-          <w:szCs w:val="20"/>
+          <w:sz w:val="22"/>
+          <w:szCs w:val="22"/>
         </w:rPr>
         <w:t>{{CNO}}</w:t>
       </w:r>
@@ -594,8 +573,8 @@
       <w:r>
         <w:rPr>
           <w:rFonts w:ascii="Tahoma" w:hAnsi="Tahoma" w:cs="Tahoma"/>
-          <w:sz w:val="20"/>
-          <w:szCs w:val="20"/>
+          <w:sz w:val="22"/>
+          <w:szCs w:val="22"/>
         </w:rPr>
         <w:t xml:space="preserve">-  </w:t>
       </w:r>
@@ -603,8 +582,8 @@
         <w:rPr>
           <w:rFonts w:ascii="Tahoma" w:hAnsi="Tahoma" w:cs="Tahoma"/>
           <w:bCs/>
-          <w:sz w:val="20"/>
-          <w:szCs w:val="20"/>
+          <w:sz w:val="22"/>
+          <w:szCs w:val="22"/>
         </w:rPr>
         <w:t>{</w:t>
       </w:r>
@@ -613,22 +592,22 @@
         <w:rPr>
           <w:rFonts w:ascii="Tahoma" w:hAnsi="Tahoma" w:cs="Tahoma"/>
           <w:bCs/>
-          <w:sz w:val="20"/>
-          <w:szCs w:val="20"/>
+          <w:sz w:val="22"/>
+          <w:szCs w:val="22"/>
         </w:rPr>
         <w:t>{Name of the work}}</w:t>
       </w:r>
     </w:p>
     <w:tbl>
       <w:tblPr>
-        <w:tblW w:w="4400" w:type="dxa"/>
+        <w:tblW w:w="6100" w:type="dxa"/>
         <w:jc w:val="center"/>
         <w:tblLayout w:type="fixed"/>
         <w:tblLook w:val="04A0" w:firstRow="1" w:lastRow="0" w:firstColumn="1" w:lastColumn="0" w:noHBand="0" w:noVBand="1"/>
       </w:tblPr>
       <w:tblGrid>
-        <w:gridCol w:w="2750"/>
-        <w:gridCol w:w="1650"/>
+        <w:gridCol w:w="3700"/>
+        <w:gridCol w:w="2400"/>
       </w:tblGrid>
       <w:tr>
         <w:trPr>
@@ -636,7 +615,7 @@
         </w:trPr>
         <w:tc>
           <w:tcPr>
-            <w:tcW w:w="2750" w:type="dxa"/>
+            <w:tcW w:w="3700" w:type="dxa"/>
             <w:tcBorders>
               <w:top w:val="nil"/>
               <w:left w:val="nil"/>
@@ -651,16 +630,16 @@
               <w:rPr>
                 <w:rFonts w:ascii="Tahoma" w:hAnsi="Tahoma" w:cs="Tahoma"/>
                 <w:b/>
-                <w:sz w:val="20"/>
-                <w:szCs w:val="20"/>
+                <w:sz w:val="22"/>
+                <w:szCs w:val="22"/>
               </w:rPr>
             </w:pPr>
             <w:r>
               <w:rPr>
                 <w:rFonts w:ascii="Tahoma" w:hAnsi="Tahoma" w:cs="Tahoma"/>
                 <w:b/>
-                <w:sz w:val="20"/>
-                <w:szCs w:val="20"/>
+                <w:sz w:val="22"/>
+                <w:szCs w:val="22"/>
               </w:rPr>
               <w:t xml:space="preserve">Amount of Estimate</w:t>
             </w:r>
@@ -668,7 +647,7 @@
         </w:tc>
         <w:tc>
           <w:tcPr>
-            <w:tcW w:w="1650" w:type="dxa"/>
+            <w:tcW w:w="2400" w:type="dxa"/>
             <w:tcBorders>
               <w:top w:val="nil"/>
               <w:left w:val="nil"/>
@@ -683,16 +662,16 @@
               <w:rPr>
                 <w:rFonts w:ascii="Tahoma" w:hAnsi="Tahoma" w:cs="Tahoma"/>
                 <w:b/>
-                <w:sz w:val="20"/>
-                <w:szCs w:val="20"/>
+                <w:sz w:val="22"/>
+                <w:szCs w:val="22"/>
               </w:rPr>
             </w:pPr>
             <w:r>
               <w:rPr>
                 <w:rFonts w:ascii="Tahoma" w:hAnsi="Tahoma" w:cs="Tahoma"/>
                 <w:b/>
-                <w:sz w:val="20"/>
-                <w:szCs w:val="20"/>
+                <w:sz w:val="22"/>
+                <w:szCs w:val="22"/>
               </w:rPr>
               <w:t xml:space="preserve">: </w:t>
             </w:r>
@@ -700,8 +679,8 @@
               <w:rPr>
                 <w:rFonts w:ascii="Tahoma" w:hAnsi="Tahoma" w:cs="Tahoma"/>
                 <w:bCs/>
-                <w:sz w:val="20"/>
-                <w:szCs w:val="20"/>
+                <w:sz w:val="22"/>
+                <w:szCs w:val="22"/>
               </w:rPr>
               <w:t xml:space="preserve">Rs.{{Estimate Amount}} Lakhs</w:t>
             </w:r>
@@ -714,7 +693,7 @@
         </w:trPr>
         <w:tc>
           <w:tcPr>
-            <w:tcW w:w="2750" w:type="dxa"/>
+            <w:tcW w:w="3700" w:type="dxa"/>
             <w:tcBorders>
               <w:top w:val="nil"/>
               <w:left w:val="nil"/>
@@ -729,16 +708,16 @@
               <w:rPr>
                 <w:rFonts w:ascii="Tahoma" w:hAnsi="Tahoma" w:cs="Tahoma"/>
                 <w:b/>
-                <w:sz w:val="20"/>
-                <w:szCs w:val="20"/>
+                <w:sz w:val="22"/>
+                <w:szCs w:val="22"/>
               </w:rPr>
             </w:pPr>
             <w:r>
               <w:rPr>
                 <w:rFonts w:ascii="Tahoma" w:hAnsi="Tahoma" w:cs="Tahoma"/>
                 <w:b/>
-                <w:sz w:val="20"/>
-                <w:szCs w:val="20"/>
+                <w:sz w:val="22"/>
+                <w:szCs w:val="22"/>
               </w:rPr>
               <w:t xml:space="preserve">Estimated Contract Value</w:t>
             </w:r>
@@ -746,7 +725,7 @@
         </w:tc>
         <w:tc>
           <w:tcPr>
-            <w:tcW w:w="1650" w:type="dxa"/>
+            <w:tcW w:w="2400" w:type="dxa"/>
             <w:tcBorders>
               <w:top w:val="nil"/>
               <w:left w:val="nil"/>
@@ -761,16 +740,16 @@
               <w:rPr>
                 <w:rFonts w:ascii="Tahoma" w:hAnsi="Tahoma" w:cs="Tahoma"/>
                 <w:b/>
-                <w:sz w:val="20"/>
-                <w:szCs w:val="20"/>
+                <w:sz w:val="22"/>
+                <w:szCs w:val="22"/>
               </w:rPr>
             </w:pPr>
             <w:r>
               <w:rPr>
                 <w:rFonts w:ascii="Tahoma" w:hAnsi="Tahoma" w:cs="Tahoma"/>
                 <w:b/>
-                <w:sz w:val="20"/>
-                <w:szCs w:val="20"/>
+                <w:sz w:val="22"/>
+                <w:szCs w:val="22"/>
               </w:rPr>
               <w:t xml:space="preserve">: </w:t>
             </w:r>
@@ -778,8 +757,8 @@
               <w:rPr>
                 <w:rFonts w:ascii="Tahoma" w:hAnsi="Tahoma" w:cs="Tahoma"/>
                 <w:bCs/>
-                <w:sz w:val="20"/>
-                <w:szCs w:val="20"/>
+                <w:sz w:val="22"/>
+                <w:szCs w:val="22"/>
               </w:rPr>
               <w:t xml:space="preserve">{{ECV}}</w:t>
             </w:r>
@@ -792,7 +771,7 @@
         </w:trPr>
         <w:tc>
           <w:tcPr>
-            <w:tcW w:w="2750" w:type="dxa"/>
+            <w:tcW w:w="3700" w:type="dxa"/>
             <w:tcBorders>
               <w:top w:val="nil"/>
               <w:left w:val="nil"/>
@@ -807,16 +786,16 @@
               <w:rPr>
                 <w:rFonts w:ascii="Tahoma" w:hAnsi="Tahoma" w:cs="Tahoma"/>
                 <w:b/>
-                <w:sz w:val="20"/>
-                <w:szCs w:val="20"/>
+                <w:sz w:val="22"/>
+                <w:szCs w:val="22"/>
               </w:rPr>
             </w:pPr>
             <w:r>
               <w:rPr>
                 <w:rFonts w:ascii="Tahoma" w:hAnsi="Tahoma" w:cs="Tahoma"/>
                 <w:b/>
-                <w:sz w:val="20"/>
-                <w:szCs w:val="20"/>
+                <w:sz w:val="22"/>
+                <w:szCs w:val="22"/>
               </w:rPr>
               <w:t xml:space="preserve">Tender Percentage</w:t>
             </w:r>
@@ -824,7 +803,7 @@
         </w:tc>
         <w:tc>
           <w:tcPr>
-            <w:tcW w:w="1650" w:type="dxa"/>
+            <w:tcW w:w="2400" w:type="dxa"/>
             <w:tcBorders>
               <w:top w:val="nil"/>
               <w:left w:val="nil"/>
@@ -839,15 +818,15 @@
               <w:rPr>
                 <w:rFonts w:ascii="Tahoma" w:hAnsi="Tahoma" w:cs="Tahoma"/>
                 <w:b/>
-                <w:sz w:val="20"/>
-                <w:szCs w:val="20"/>
+                <w:sz w:val="22"/>
+                <w:szCs w:val="22"/>
               </w:rPr>
             </w:pPr>
             <w:r>
               <w:rPr>
                 <w:rFonts w:ascii="Tahoma" w:hAnsi="Tahoma" w:cs="Tahoma"/>
-                <w:sz w:val="20"/>
-                <w:szCs w:val="20"/>
+                <w:sz w:val="22"/>
+                <w:szCs w:val="22"/>
               </w:rPr>
               <w:t xml:space="preserve">: (-){{Tender percentage}}%-Less</w:t>
             </w:r>
@@ -860,7 +839,7 @@
         </w:trPr>
         <w:tc>
           <w:tcPr>
-            <w:tcW w:w="2750" w:type="dxa"/>
+            <w:tcW w:w="3700" w:type="dxa"/>
             <w:tcBorders>
               <w:top w:val="nil"/>
               <w:left w:val="nil"/>
@@ -875,16 +854,16 @@
               <w:rPr>
                 <w:rFonts w:ascii="Tahoma" w:hAnsi="Tahoma" w:cs="Tahoma"/>
                 <w:b/>
-                <w:sz w:val="20"/>
-                <w:szCs w:val="20"/>
+                <w:sz w:val="22"/>
+                <w:szCs w:val="22"/>
               </w:rPr>
             </w:pPr>
             <w:r>
               <w:rPr>
                 <w:rFonts w:ascii="Tahoma" w:hAnsi="Tahoma" w:cs="Tahoma"/>
                 <w:b/>
-                <w:sz w:val="20"/>
-                <w:szCs w:val="20"/>
+                <w:sz w:val="22"/>
+                <w:szCs w:val="22"/>
               </w:rPr>
               <w:t xml:space="preserve">Amount of Contract Value</w:t>
             </w:r>
@@ -892,7 +871,7 @@
         </w:tc>
         <w:tc>
           <w:tcPr>
-            <w:tcW w:w="1650" w:type="dxa"/>
+            <w:tcW w:w="2400" w:type="dxa"/>
             <w:tcBorders>
               <w:top w:val="nil"/>
               <w:left w:val="nil"/>
@@ -907,16 +886,16 @@
               <w:rPr>
                 <w:rFonts w:ascii="Tahoma" w:hAnsi="Tahoma" w:cs="Tahoma"/>
                 <w:b/>
-                <w:sz w:val="20"/>
-                <w:szCs w:val="20"/>
+                <w:sz w:val="22"/>
+                <w:szCs w:val="22"/>
               </w:rPr>
             </w:pPr>
             <w:r>
               <w:rPr>
                 <w:rFonts w:ascii="Tahoma" w:hAnsi="Tahoma" w:cs="Tahoma"/>
                 <w:b/>
-                <w:sz w:val="20"/>
-                <w:szCs w:val="20"/>
+                <w:sz w:val="22"/>
+                <w:szCs w:val="22"/>
               </w:rPr>
               <w:t xml:space="preserve">: </w:t>
             </w:r>
@@ -924,8 +903,8 @@
               <w:rPr>
                 <w:rFonts w:ascii="Tahoma" w:hAnsi="Tahoma" w:cs="Tahoma"/>
                 <w:bCs/>
-                <w:sz w:val="20"/>
-                <w:szCs w:val="20"/>
+                <w:sz w:val="22"/>
+                <w:szCs w:val="22"/>
               </w:rPr>
               <w:t xml:space="preserve">{{Contract value}}</w:t>
             </w:r>
@@ -965,143 +944,133 @@
           <w:rFonts w:ascii="Tahoma" w:hAnsi="Tahoma" w:cs="Tahoma"/>
           <w:b/>
           <w:spacing w:val="-20"/>
+          <w:sz w:val="22"/>
+          <w:szCs w:val="22"/>
+        </w:rPr>
+      </w:pPr>
+      <w:proofErr w:type="spellStart"/>
+      <w:r>
+        <w:rPr>
+          <w:rFonts w:ascii="Tahoma" w:hAnsi="Tahoma" w:cs="Tahoma"/>
+          <w:b/>
+          <w:spacing w:val="-20"/>
+          <w:sz w:val="22"/>
+          <w:szCs w:val="22"/>
+        </w:rPr>
+        <w:t>A.</w:t>
+      </w:r>
+      <w:proofErr w:type="gramStart"/>
+      <w:r>
+        <w:rPr>
+          <w:rFonts w:ascii="Tahoma" w:hAnsi="Tahoma" w:cs="Tahoma"/>
+          <w:b/>
+          <w:spacing w:val="-20"/>
+          <w:sz w:val="22"/>
+          <w:szCs w:val="22"/>
+        </w:rPr>
+        <w:t>B.No</w:t>
+      </w:r>
+      <w:proofErr w:type="spellEnd"/>
+      <w:proofErr w:type="gramEnd"/>
+      <w:r>
+        <w:rPr>
+          <w:rFonts w:ascii="Tahoma" w:hAnsi="Tahoma" w:cs="Tahoma"/>
+          <w:b/>
+          <w:spacing w:val="-20"/>
+          <w:sz w:val="22"/>
+          <w:szCs w:val="22"/>
+        </w:rPr>
+        <w:t>:________/ EE/</w:t>
+      </w:r>
+      <w:r>
+        <w:rPr>
+          <w:rFonts w:ascii="Tahoma" w:hAnsi="Tahoma" w:cs="Tahoma"/>
+          <w:b/>
+          <w:spacing w:val="-20"/>
+          <w:sz w:val="22"/>
+          <w:szCs w:val="22"/>
+        </w:rPr>
+        <w:t>{{Circle}}</w:t>
+      </w:r>
+      <w:r>
+        <w:rPr>
+          <w:rFonts w:ascii="Tahoma" w:hAnsi="Tahoma" w:cs="Tahoma"/>
+          <w:b/>
+          <w:spacing w:val="-20"/>
+          <w:sz w:val="22"/>
+          <w:szCs w:val="22"/>
+        </w:rPr>
+        <w:t>/CIRCLE-</w:t>
+      </w:r>
+      <w:r>
+        <w:rPr>
+          <w:rFonts w:ascii="Tahoma" w:hAnsi="Tahoma" w:cs="Tahoma"/>
+          <w:b/>
+          <w:spacing w:val="-20"/>
+          <w:sz w:val="22"/>
+          <w:szCs w:val="22"/>
+        </w:rPr>
+        <w:t>{{CNO}}</w:t>
+      </w:r>
+      <w:r>
+        <w:rPr>
+          <w:rFonts w:ascii="Tahoma" w:hAnsi="Tahoma" w:cs="Tahoma"/>
+          <w:b/>
+          <w:spacing w:val="-20"/>
+          <w:sz w:val="22"/>
+          <w:szCs w:val="22"/>
+        </w:rPr>
+        <w:t>/{{ZoneAbbr}}/{{Corporation}}/{{Financialyear}}</w:t>
+      </w:r>
+      <w:r>
+        <w:rPr>
+          <w:rFonts w:ascii="Tahoma" w:hAnsi="Tahoma" w:cs="Tahoma"/>
+          <w:b/>
+          <w:spacing w:val="-20"/>
+          <w:sz w:val="22"/>
+          <w:szCs w:val="22"/>
+        </w:rPr>
+        <w:tab/>
+        <w:t xml:space="preserve">Dt: </w:t>
+      </w:r>
+      <w:r>
+        <w:rPr>
+          <w:rFonts w:ascii="Tahoma" w:hAnsi="Tahoma" w:cs="Tahoma"/>
+          <w:b/>
+          <w:spacing w:val="-20"/>
+          <w:sz w:val="22"/>
+          <w:szCs w:val="22"/>
+        </w:rPr>
+        <w:t>{{Agreement Date}}</w:t>
+      </w:r>
+    </w:p>
+    <w:p>
+      <w:pPr>
+        <w:spacing w:after="0" w:line="240" w:lineRule="auto"/>
+        <w:rPr>
+          <w:rFonts w:ascii="Tahoma" w:hAnsi="Tahoma" w:cs="Tahoma"/>
           <w:sz w:val="20"/>
           <w:szCs w:val="20"/>
         </w:rPr>
       </w:pPr>
-      <w:proofErr w:type="spellStart"/>
-      <w:r>
-        <w:rPr>
-          <w:rFonts w:ascii="Tahoma" w:hAnsi="Tahoma" w:cs="Tahoma"/>
-          <w:b/>
-          <w:spacing w:val="-20"/>
-          <w:sz w:val="20"/>
-          <w:szCs w:val="20"/>
-        </w:rPr>
-        <w:t>A.</w:t>
-      </w:r>
-      <w:proofErr w:type="gramStart"/>
-      <w:r>
-        <w:rPr>
-          <w:rFonts w:ascii="Tahoma" w:hAnsi="Tahoma" w:cs="Tahoma"/>
-          <w:b/>
-          <w:spacing w:val="-20"/>
-          <w:sz w:val="20"/>
-          <w:szCs w:val="20"/>
-        </w:rPr>
-        <w:t>B.No</w:t>
-      </w:r>
-      <w:proofErr w:type="spellEnd"/>
-      <w:proofErr w:type="gramEnd"/>
-      <w:r>
-        <w:rPr>
-          <w:rFonts w:ascii="Tahoma" w:hAnsi="Tahoma" w:cs="Tahoma"/>
-          <w:b/>
-          <w:spacing w:val="-20"/>
-          <w:sz w:val="20"/>
-          <w:szCs w:val="20"/>
-        </w:rPr>
-        <w:t>:________/ EE/</w:t>
-      </w:r>
-      <w:r>
-        <w:rPr>
-          <w:rFonts w:ascii="Tahoma" w:hAnsi="Tahoma" w:cs="Tahoma"/>
-          <w:b/>
-          <w:spacing w:val="-20"/>
-          <w:sz w:val="20"/>
-          <w:szCs w:val="20"/>
-        </w:rPr>
-        <w:t>{{Circle}}</w:t>
-      </w:r>
-      <w:r>
-        <w:rPr>
-          <w:rFonts w:ascii="Tahoma" w:hAnsi="Tahoma" w:cs="Tahoma"/>
-          <w:b/>
-          <w:spacing w:val="-20"/>
-          <w:sz w:val="20"/>
-          <w:szCs w:val="20"/>
-        </w:rPr>
-        <w:t>/CIRCLE-</w:t>
-      </w:r>
-      <w:r>
-        <w:rPr>
-          <w:rFonts w:ascii="Tahoma" w:hAnsi="Tahoma" w:cs="Tahoma"/>
-          <w:b/>
-          <w:spacing w:val="-20"/>
-          <w:sz w:val="20"/>
-          <w:szCs w:val="20"/>
-        </w:rPr>
-        <w:t>{{CNO}}</w:t>
-      </w:r>
-      <w:r>
-        <w:rPr>
-          <w:rFonts w:ascii="Tahoma" w:hAnsi="Tahoma" w:cs="Tahoma"/>
-          <w:b/>
-          <w:spacing w:val="-20"/>
-          <w:sz w:val="20"/>
-          <w:szCs w:val="20"/>
-        </w:rPr>
-        <w:t>/{{ZoneAbbr}}/{{Corporation}}/{{Financialyear}}</w:t>
-      </w:r>
-      <w:r>
-        <w:rPr>
-          <w:rFonts w:ascii="Tahoma" w:hAnsi="Tahoma" w:cs="Tahoma"/>
-          <w:b/>
-          <w:spacing w:val="-20"/>
-          <w:sz w:val="20"/>
-          <w:szCs w:val="20"/>
-        </w:rPr>
-        <w:tab/>
-        <w:t xml:space="preserve">Dt: </w:t>
-      </w:r>
-      <w:r>
-        <w:rPr>
-          <w:rFonts w:ascii="Tahoma" w:hAnsi="Tahoma" w:cs="Tahoma"/>
-          <w:b/>
-          <w:spacing w:val="-20"/>
-          <w:sz w:val="20"/>
-          <w:szCs w:val="20"/>
-        </w:rPr>
-        <w:t>{{Agreement Date}}</w:t>
-      </w:r>
-    </w:p>
-    <w:p>
-      <w:pPr>
-        <w:spacing w:after="0" w:line="240" w:lineRule="auto"/>
-        <w:rPr>
-          <w:rFonts w:ascii="Tahoma" w:hAnsi="Tahoma" w:cs="Tahoma"/>
-          <w:sz w:val="20"/>
-          <w:szCs w:val="20"/>
-        </w:rPr>
-      </w:pPr>
-    </w:p>
-    <w:p>
-      <w:pPr>
-        <w:spacing w:after="0" w:line="240" w:lineRule="auto"/>
-        <w:rPr>
-          <w:rFonts w:ascii="Tahoma" w:hAnsi="Tahoma" w:cs="Tahoma"/>
-          <w:sz w:val="20"/>
-          <w:szCs w:val="20"/>
-        </w:rPr>
-      </w:pPr>
-    </w:p>
-    <w:p>
-      <w:pPr>
-        <w:spacing w:after="0" w:line="240" w:lineRule="auto"/>
+    </w:p>
+    <w:p>
+      <w:pPr>
+        <w:spacing w:after="200" w:line="240" w:lineRule="auto"/>
         <w:ind w:firstLine="720"/>
         <w:jc w:val="both"/>
         <w:rPr>
           <w:rFonts w:ascii="Tahoma" w:hAnsi="Tahoma" w:cs="Tahoma"/>
           <w:bCs/>
-          <w:sz w:val="20"/>
-          <w:szCs w:val="20"/>
-        </w:rPr>
-      </w:pPr>
-      <w:r>
-        <w:rPr>
-          <w:rFonts w:ascii="Tahoma" w:hAnsi="Tahoma" w:cs="Tahoma"/>
-          <w:sz w:val="20"/>
-          <w:szCs w:val="20"/>
+          <w:sz w:val="22"/>
+          <w:szCs w:val="22"/>
+        </w:rPr>
+      </w:pPr>
+      <w:r>
+        <w:rPr>
+          <w:rFonts w:ascii="Tahoma" w:hAnsi="Tahoma" w:cs="Tahoma"/>
+          <w:sz w:val="22"/>
+          <w:szCs w:val="22"/>
         </w:rPr>
         <w:t xml:space="preserve">Agreement is made on this </w:t>
       </w:r>
@@ -1110,24 +1079,24 @@
           <w:rFonts w:ascii="Tahoma" w:hAnsi="Tahoma" w:cs="Tahoma"/>
           <w:b/>
           <w:bCs/>
-          <w:sz w:val="20"/>
-          <w:szCs w:val="20"/>
+          <w:sz w:val="22"/>
+          <w:szCs w:val="22"/>
         </w:rPr>
         <w:t xml:space="preserve">{{Agreement date in words}}</w:t>
       </w:r>
       <w:r>
         <w:rPr>
           <w:rFonts w:ascii="Tahoma" w:hAnsi="Tahoma" w:cs="Tahoma"/>
-          <w:sz w:val="20"/>
-          <w:szCs w:val="20"/>
+          <w:sz w:val="22"/>
+          <w:szCs w:val="22"/>
         </w:rPr>
         <w:t xml:space="preserve"> between M/s.</w:t>
       </w:r>
       <w:r>
         <w:rPr>
           <w:rFonts w:ascii="Tahoma" w:hAnsi="Tahoma" w:cs="Tahoma"/>
-          <w:sz w:val="20"/>
-          <w:szCs w:val="20"/>
+          <w:sz w:val="22"/>
+          <w:szCs w:val="22"/>
         </w:rPr>
         <w:t xml:space="preserve">/</w:t>
       </w:r>
@@ -1135,8 +1104,8 @@
         <w:rPr>
           <w:rFonts w:ascii="Tahoma" w:hAnsi="Tahoma" w:cs="Tahoma"/>
           <w:spacing w:val="120"/>
-          <w:sz w:val="20"/>
-          <w:szCs w:val="20"/>
+          <w:sz w:val="22"/>
+          <w:szCs w:val="22"/>
         </w:rPr>
         <w:t xml:space="preserve"> </w:t>
       </w:r>
@@ -1145,16 +1114,16 @@
           <w:rFonts w:ascii="Tahoma" w:hAnsi="Tahoma" w:cs="Tahoma"/>
           <w:b/>
           <w:bCs/>
-          <w:sz w:val="20"/>
-          <w:szCs w:val="20"/>
+          <w:sz w:val="22"/>
+          <w:szCs w:val="22"/>
         </w:rPr>
         <w:t xml:space="preserve">{{Agency Name}}</w:t>
       </w:r>
       <w:r>
         <w:rPr>
           <w:rFonts w:ascii="Tahoma" w:hAnsi="Tahoma" w:cs="Tahoma"/>
-          <w:sz w:val="20"/>
-          <w:szCs w:val="20"/>
+          <w:sz w:val="22"/>
+          <w:szCs w:val="22"/>
         </w:rPr>
         <w:t xml:space="preserve"> Contractor/Agency on one part and the Commissioner, {{Corporation}} behalf of </w:t>
       </w:r>
@@ -1162,8 +1131,8 @@
       <w:r>
         <w:rPr>
           <w:rFonts w:ascii="Tahoma" w:hAnsi="Tahoma" w:cs="Tahoma"/>
-          <w:sz w:val="20"/>
-          <w:szCs w:val="20"/>
+          <w:sz w:val="22"/>
+          <w:szCs w:val="22"/>
         </w:rPr>
         <w:t>{{Corp Full}}</w:t>
       </w:r>
@@ -1171,8 +1140,8 @@
       <w:r>
         <w:rPr>
           <w:rFonts w:ascii="Tahoma" w:hAnsi="Tahoma" w:cs="Tahoma"/>
-          <w:sz w:val="20"/>
-          <w:szCs w:val="20"/>
+          <w:sz w:val="22"/>
+          <w:szCs w:val="22"/>
         </w:rPr>
         <w:t xml:space="preserve"> on other part. </w:t>
       </w:r>
@@ -1180,8 +1149,8 @@
         <w:rPr>
           <w:rFonts w:ascii="Tahoma" w:hAnsi="Tahoma" w:cs="Tahoma"/>
           <w:bCs/>
-          <w:sz w:val="20"/>
-          <w:szCs w:val="20"/>
+          <w:sz w:val="22"/>
+          <w:szCs w:val="22"/>
         </w:rPr>
         <w:t xml:space="preserve">Whereby </w:t>
       </w:r>
@@ -1190,8 +1159,8 @@
         <w:rPr>
           <w:rFonts w:ascii="Tahoma" w:hAnsi="Tahoma" w:cs="Tahoma"/>
           <w:bCs/>
-          <w:sz w:val="20"/>
-          <w:szCs w:val="20"/>
+          <w:sz w:val="22"/>
+          <w:szCs w:val="22"/>
         </w:rPr>
         <w:t>the both</w:t>
       </w:r>
@@ -1200,8 +1169,8 @@
         <w:rPr>
           <w:rFonts w:ascii="Tahoma" w:hAnsi="Tahoma" w:cs="Tahoma"/>
           <w:bCs/>
-          <w:sz w:val="20"/>
-          <w:szCs w:val="20"/>
+          <w:sz w:val="22"/>
+          <w:szCs w:val="22"/>
         </w:rPr>
         <w:t xml:space="preserve"> parties have agreed to the terms and conditions set for in L.S. Agreement.</w:t>
       </w:r>
@@ -1221,20 +1190,20 @@
     </w:p>
     <w:p>
       <w:pPr>
-        <w:spacing w:line="240" w:lineRule="auto"/>
+        <w:spacing w:after="280" w:line="240" w:lineRule="auto"/>
         <w:ind w:firstLine="720"/>
         <w:jc w:val="both"/>
         <w:rPr>
           <w:rFonts w:ascii="Tahoma" w:hAnsi="Tahoma" w:cs="Tahoma"/>
-          <w:sz w:val="20"/>
-          <w:szCs w:val="20"/>
-        </w:rPr>
-      </w:pPr>
-      <w:r>
-        <w:rPr>
-          <w:rFonts w:ascii="Tahoma" w:hAnsi="Tahoma" w:cs="Tahoma"/>
-          <w:sz w:val="20"/>
-          <w:szCs w:val="20"/>
+          <w:sz w:val="22"/>
+          <w:szCs w:val="22"/>
+        </w:rPr>
+      </w:pPr>
+      <w:r>
+        <w:rPr>
+          <w:rFonts w:ascii="Tahoma" w:hAnsi="Tahoma" w:cs="Tahoma"/>
+          <w:sz w:val="22"/>
+          <w:szCs w:val="22"/>
         </w:rPr>
         <w:t xml:space="preserve">Agreement made for the above work for an amount of </w:t>
       </w:r>
@@ -1243,8 +1212,8 @@
           <w:rFonts w:ascii="Tahoma" w:hAnsi="Tahoma" w:cs="Tahoma"/>
           <w:b/>
           <w:bCs/>
-          <w:sz w:val="20"/>
-          <w:szCs w:val="20"/>
+          <w:sz w:val="22"/>
+          <w:szCs w:val="22"/>
         </w:rPr>
         <w:t xml:space="preserve">{{Contract value}}</w:t>
       </w:r>
@@ -1253,8 +1222,8 @@
           <w:rFonts w:ascii="Tahoma" w:hAnsi="Tahoma" w:cs="Tahoma"/>
           <w:b/>
           <w:bCs/>
-          <w:sz w:val="20"/>
-          <w:szCs w:val="20"/>
+          <w:sz w:val="22"/>
+          <w:szCs w:val="22"/>
         </w:rPr>
         <w:t xml:space="preserve"> /</w:t>
       </w:r>
@@ -1264,24 +1233,24 @@
           <w:rFonts w:ascii="Tahoma" w:hAnsi="Tahoma" w:cs="Tahoma"/>
           <w:b/>
           <w:bCs/>
-          <w:sz w:val="20"/>
-          <w:szCs w:val="20"/>
+          <w:sz w:val="22"/>
+          <w:szCs w:val="22"/>
         </w:rPr>
         <w:t>-</w:t>
       </w:r>
       <w:r>
         <w:rPr>
           <w:rFonts w:ascii="Tahoma" w:hAnsi="Tahoma" w:cs="Tahoma"/>
-          <w:sz w:val="20"/>
-          <w:szCs w:val="20"/>
+          <w:sz w:val="22"/>
+          <w:szCs w:val="22"/>
         </w:rPr>
         <w:t>(</w:t>
       </w:r>
       <w:r>
         <w:rPr>
           <w:rFonts w:ascii="Tahoma" w:hAnsi="Tahoma" w:cs="Tahoma"/>
-          <w:sz w:val="20"/>
-          <w:szCs w:val="20"/>
+          <w:sz w:val="22"/>
+          <w:szCs w:val="22"/>
         </w:rPr>
         <w:t xml:space="preserve">Rupees </w:t>
       </w:r>
@@ -1291,28 +1260,28 @@
           <w:rFonts w:ascii="Tahoma" w:hAnsi="Tahoma" w:cs="Tahoma"/>
           <w:b/>
           <w:bCs/>
-          <w:sz w:val="20"/>
-          <w:szCs w:val="20"/>
+          <w:sz w:val="22"/>
+          <w:szCs w:val="22"/>
         </w:rPr>
         <w:t>{{Contract value in rupees}}</w:t>
       </w:r>
       <w:r>
         <w:rPr>
           <w:rFonts w:ascii="Tahoma" w:hAnsi="Tahoma" w:cs="Tahoma"/>
-          <w:sz w:val="20"/>
-          <w:szCs w:val="20"/>
+          <w:sz w:val="22"/>
+          <w:szCs w:val="22"/>
         </w:rPr>
         <w:t xml:space="preserve">) </w:t>
       </w:r>
     </w:p>
     <w:p>
       <w:pPr>
-        <w:spacing w:line="240" w:lineRule="auto"/>
+        <w:spacing w:after="280" w:line="240" w:lineRule="auto"/>
         <w:jc w:val="both"/>
         <w:rPr>
           <w:rFonts w:ascii="Tahoma" w:hAnsi="Tahoma" w:cs="Tahoma"/>
-          <w:sz w:val="20"/>
-          <w:szCs w:val="20"/>
+          <w:sz w:val="22"/>
+          <w:szCs w:val="22"/>
         </w:rPr>
       </w:pPr>
       <w:r>
@@ -1320,16 +1289,16 @@
           <w:rFonts w:ascii="Tahoma" w:hAnsi="Tahoma" w:cs="Tahoma"/>
           <w:bCs/>
           <w:spacing w:val="-20"/>
-          <w:sz w:val="20"/>
-          <w:szCs w:val="20"/>
+          <w:sz w:val="22"/>
+          <w:szCs w:val="22"/>
         </w:rPr>
         <w:tab/>
       </w:r>
       <w:r>
         <w:rPr>
           <w:rFonts w:ascii="Tahoma" w:hAnsi="Tahoma" w:cs="Tahoma"/>
-          <w:sz w:val="20"/>
-          <w:szCs w:val="20"/>
+          <w:sz w:val="22"/>
+          <w:szCs w:val="22"/>
         </w:rPr>
         <w:t xml:space="preserve">Executed on this </w:t>
       </w:r>
@@ -1338,8 +1307,8 @@
           <w:rFonts w:ascii="Tahoma" w:hAnsi="Tahoma" w:cs="Tahoma"/>
           <w:b/>
           <w:bCs/>
-          <w:sz w:val="20"/>
-          <w:szCs w:val="20"/>
+          <w:sz w:val="22"/>
+          <w:szCs w:val="22"/>
         </w:rPr>
         <w:t>{{Agreement date in words}}</w:t>
       </w:r>
@@ -1610,15 +1579,15 @@
         <w:spacing w:after="0" w:line="240" w:lineRule="auto"/>
         <w:rPr>
           <w:rFonts w:ascii="Tahoma" w:hAnsi="Tahoma" w:cs="Tahoma"/>
-          <w:sz w:val="20"/>
-          <w:szCs w:val="20"/>
-        </w:rPr>
-      </w:pPr>
-      <w:r>
-        <w:rPr>
-          <w:rFonts w:ascii="Tahoma" w:hAnsi="Tahoma" w:cs="Tahoma"/>
-          <w:sz w:val="20"/>
-          <w:szCs w:val="20"/>
+          <w:sz w:val="22"/>
+          <w:szCs w:val="22"/>
+        </w:rPr>
+      </w:pPr>
+      <w:r>
+        <w:rPr>
+          <w:rFonts w:ascii="Tahoma" w:hAnsi="Tahoma" w:cs="Tahoma"/>
+          <w:sz w:val="22"/>
+          <w:szCs w:val="22"/>
         </w:rPr>
         <w:t>1)</w:t>
       </w:r>
@@ -1628,15 +1597,15 @@
         <w:spacing w:after="0" w:line="240" w:lineRule="auto"/>
         <w:rPr>
           <w:rFonts w:ascii="Tahoma" w:hAnsi="Tahoma" w:cs="Tahoma"/>
-          <w:sz w:val="20"/>
-          <w:szCs w:val="20"/>
-        </w:rPr>
-      </w:pPr>
-      <w:r>
-        <w:rPr>
-          <w:rFonts w:ascii="Tahoma" w:hAnsi="Tahoma" w:cs="Tahoma"/>
-          <w:sz w:val="20"/>
-          <w:szCs w:val="20"/>
+          <w:sz w:val="22"/>
+          <w:szCs w:val="22"/>
+        </w:rPr>
+      </w:pPr>
+      <w:r>
+        <w:rPr>
+          <w:rFonts w:ascii="Tahoma" w:hAnsi="Tahoma" w:cs="Tahoma"/>
+          <w:sz w:val="22"/>
+          <w:szCs w:val="22"/>
         </w:rPr>
         <w:t>2)</w:t>
       </w:r>

</xml_diff>